<commit_message>
Fix duplicated email in final paper
</commit_message>
<xml_diff>
--- a/final-paper/final-paper.docx
+++ b/final-paper/final-paper.docx
@@ -148,7 +148,7 @@
           <w:sz w:val="28"/>
           <w:szCs w:val="28"/>
         </w:rPr>
-        <w:t xml:space="preserve"> </w:t>
+        <w:t xml:space="preserve"> 张芝源 zhang-zy24@mails.tsinghua.edu.cn</w:t>
       </w:r>
       <w:proofErr w:type="gramStart"/>
       <w:r>
@@ -157,7 +157,6 @@
           <w:sz w:val="28"/>
           <w:szCs w:val="28"/>
         </w:rPr>
-        <w:t>张芝源</w:t>
       </w:r>
       <w:proofErr w:type="gramEnd"/>
       <w:r>
@@ -166,7 +165,6 @@
           <w:sz w:val="28"/>
           <w:szCs w:val="28"/>
         </w:rPr>
-        <w:t xml:space="preserve"> zhang-zy24@mails.tsinghua.edu.cn zhang-zy24@mails.tsinghua.edu.cn</w:t>
       </w:r>
     </w:p>
     <w:p>

</xml_diff>

<commit_message>
Polish reference section layout
</commit_message>
<xml_diff>
--- a/final-paper/final-paper.docx
+++ b/final-paper/final-paper.docx
@@ -8421,7 +8421,7 @@
       <w:pPr>
         <w:widowControl/>
         <w:shd w:val="clear" w:color="auto" w:fill="FFFFFF"/>
-        <w:spacing w:before="240" w:beforeAutospacing="1" w:after="120" w:line="480" w:lineRule="auto"/>
+        <w:spacing w:before="0" w:beforeAutospacing="1" w:after="0" w:line="480" w:lineRule="auto"/>
         <w:jc w:val="center"/>
         <w:outlineLvl w:val="0"/>
         <w:rPr>
@@ -8432,15 +8432,18 @@
           <w:sz w:val="32"/>
           <w:szCs w:val="32"/>
         </w:rPr>
-      </w:pPr>
-      <w:r>
-        <w:rPr>
-          <w:rFonts w:ascii="Times New Roman" w:eastAsia="宋体" w:hAnsi="Times New Roman" w:cs="Times New Roman"/>
-          <w:b/>
-          <w:bCs/>
+        <w:pageBreakBefore/>
+      </w:pPr>
+      <w:r>
+        <w:rPr>
+          <w:rFonts w:ascii="Times New Roman" w:eastAsia="Times New Roman" w:hAnsi="Times New Roman" w:cs="Times New Roman"/>
+          <w:b/>
+          <w:bCs/>
+          <w:i w:val="0"/>
           <w:kern w:val="36"/>
           <w:sz w:val="24"/>
           <w:szCs w:val="32"/>
+          <w:u w:val="none"/>
         </w:rPr>
         <w:t>References</w:t>
       </w:r>
@@ -8449,8 +8452,9 @@
       <w:pPr>
         <w:widowControl/>
         <w:shd w:val="clear" w:color="auto" w:fill="FFFFFF"/>
-        <w:spacing w:before="0" w:beforeAutospacing="1" w:after="0" w:line="240" w:lineRule="auto"/>
-        <w:ind w:left="720" w:hanging="720"/>
+        <w:spacing w:before="0" w:beforeAutospacing="1" w:after="0" w:line="480" w:lineRule="auto"/>
+        <w:ind w:left="720" w:hanging="720" w:right="0"/>
+        <w:jc w:val="left"/>
         <w:rPr>
           <w:rFonts w:ascii="Times New Roman" w:eastAsia="宋体" w:hAnsi="Times New Roman" w:cs="Times New Roman"/>
           <w:kern w:val="0"/>
@@ -8460,7 +8464,8 @@
       <w:proofErr w:type="spellStart"/>
       <w:r>
         <w:rPr>
-          <w:rFonts w:ascii="Times New Roman" w:eastAsia="宋体" w:hAnsi="Times New Roman" w:cs="Times New Roman"/>
+          <w:rFonts w:ascii="Times New Roman" w:eastAsia="Times New Roman" w:hAnsi="Times New Roman" w:cs="Times New Roman"/>
+          <w:b w:val="0"/>
           <w:kern w:val="0"/>
           <w:sz w:val="24"/>
         </w:rPr>
@@ -8469,7 +8474,8 @@
       <w:proofErr w:type="spellEnd"/>
       <w:r>
         <w:rPr>
-          <w:rFonts w:ascii="Times New Roman" w:eastAsia="宋体" w:hAnsi="Times New Roman" w:cs="Times New Roman"/>
+          <w:rFonts w:ascii="Times New Roman" w:eastAsia="Times New Roman" w:hAnsi="Times New Roman" w:cs="Times New Roman"/>
+          <w:b w:val="0"/>
           <w:kern w:val="0"/>
           <w:sz w:val="24"/>
         </w:rPr>
@@ -8480,8 +8486,9 @@
       <w:pPr>
         <w:widowControl/>
         <w:shd w:val="clear" w:color="auto" w:fill="FFFFFF"/>
-        <w:spacing w:before="0" w:beforeAutospacing="1" w:after="0" w:line="240" w:lineRule="auto"/>
-        <w:ind w:left="720" w:hanging="720"/>
+        <w:spacing w:before="0" w:beforeAutospacing="1" w:after="0" w:line="480" w:lineRule="auto"/>
+        <w:ind w:left="720" w:hanging="720" w:right="0"/>
+        <w:jc w:val="left"/>
         <w:rPr>
           <w:rFonts w:ascii="Times New Roman" w:eastAsia="宋体" w:hAnsi="Times New Roman" w:cs="Times New Roman"/>
           <w:kern w:val="0"/>
@@ -8491,7 +8498,8 @@
       <w:proofErr w:type="spellStart"/>
       <w:r>
         <w:rPr>
-          <w:rFonts w:ascii="Times New Roman" w:eastAsia="宋体" w:hAnsi="Times New Roman" w:cs="Times New Roman"/>
+          <w:rFonts w:ascii="Times New Roman" w:eastAsia="Times New Roman" w:hAnsi="Times New Roman" w:cs="Times New Roman"/>
+          <w:b w:val="0"/>
           <w:kern w:val="0"/>
           <w:sz w:val="24"/>
         </w:rPr>
@@ -8500,7 +8508,8 @@
       <w:proofErr w:type="spellEnd"/>
       <w:r>
         <w:rPr>
-          <w:rFonts w:ascii="Times New Roman" w:eastAsia="宋体" w:hAnsi="Times New Roman" w:cs="Times New Roman"/>
+          <w:rFonts w:ascii="Times New Roman" w:eastAsia="Times New Roman" w:hAnsi="Times New Roman" w:cs="Times New Roman"/>
+          <w:b w:val="0"/>
           <w:kern w:val="0"/>
           <w:sz w:val="24"/>
         </w:rPr>
@@ -8511,17 +8520,19 @@
       <w:pPr>
         <w:widowControl/>
         <w:shd w:val="clear" w:color="auto" w:fill="FFFFFF"/>
-        <w:spacing w:before="0" w:beforeAutospacing="1" w:after="0" w:line="240" w:lineRule="auto"/>
-        <w:ind w:left="720" w:hanging="720"/>
-        <w:rPr>
-          <w:rFonts w:ascii="Times New Roman" w:eastAsia="宋体" w:hAnsi="Times New Roman" w:cs="Times New Roman"/>
-          <w:kern w:val="0"/>
-          <w:sz w:val="24"/>
-        </w:rPr>
-      </w:pPr>
-      <w:r>
-        <w:rPr>
-          <w:rFonts w:ascii="Times New Roman" w:eastAsia="宋体" w:hAnsi="Times New Roman" w:cs="Times New Roman"/>
+        <w:spacing w:before="0" w:beforeAutospacing="1" w:after="0" w:line="480" w:lineRule="auto"/>
+        <w:ind w:left="720" w:hanging="720" w:right="0"/>
+        <w:jc w:val="left"/>
+        <w:rPr>
+          <w:rFonts w:ascii="Times New Roman" w:eastAsia="宋体" w:hAnsi="Times New Roman" w:cs="Times New Roman"/>
+          <w:kern w:val="0"/>
+          <w:sz w:val="24"/>
+        </w:rPr>
+      </w:pPr>
+      <w:r>
+        <w:rPr>
+          <w:rFonts w:ascii="Times New Roman" w:eastAsia="Times New Roman" w:hAnsi="Times New Roman" w:cs="Times New Roman"/>
+          <w:b w:val="0"/>
           <w:kern w:val="0"/>
           <w:sz w:val="24"/>
         </w:rPr>
@@ -8530,7 +8541,8 @@
       <w:proofErr w:type="gramStart"/>
       <w:r>
         <w:rPr>
-          <w:rFonts w:ascii="Times New Roman" w:eastAsia="宋体" w:hAnsi="Times New Roman" w:cs="Times New Roman"/>
+          <w:rFonts w:ascii="Times New Roman" w:eastAsia="Times New Roman" w:hAnsi="Times New Roman" w:cs="Times New Roman"/>
+          <w:b w:val="0"/>
           <w:kern w:val="0"/>
           <w:sz w:val="24"/>
         </w:rPr>
@@ -8539,7 +8551,8 @@
       <w:proofErr w:type="gramEnd"/>
       <w:r>
         <w:rPr>
-          <w:rFonts w:ascii="Times New Roman" w:eastAsia="宋体" w:hAnsi="Times New Roman" w:cs="Times New Roman"/>
+          <w:rFonts w:ascii="Times New Roman" w:eastAsia="Times New Roman" w:hAnsi="Times New Roman" w:cs="Times New Roman"/>
+          <w:b w:val="0"/>
           <w:kern w:val="0"/>
           <w:sz w:val="24"/>
         </w:rPr>
@@ -8550,17 +8563,19 @@
       <w:pPr>
         <w:widowControl/>
         <w:shd w:val="clear" w:color="auto" w:fill="FFFFFF"/>
-        <w:spacing w:before="0" w:beforeAutospacing="1" w:after="0" w:line="240" w:lineRule="auto"/>
-        <w:ind w:left="720" w:hanging="720"/>
-        <w:rPr>
-          <w:rFonts w:ascii="Times New Roman" w:eastAsia="宋体" w:hAnsi="Times New Roman" w:cs="Times New Roman"/>
-          <w:kern w:val="0"/>
-          <w:sz w:val="24"/>
-        </w:rPr>
-      </w:pPr>
-      <w:r>
-        <w:rPr>
-          <w:rFonts w:ascii="Times New Roman" w:eastAsia="宋体" w:hAnsi="Times New Roman" w:cs="Times New Roman"/>
+        <w:spacing w:before="0" w:beforeAutospacing="1" w:after="0" w:line="480" w:lineRule="auto"/>
+        <w:ind w:left="720" w:hanging="720" w:right="0"/>
+        <w:jc w:val="left"/>
+        <w:rPr>
+          <w:rFonts w:ascii="Times New Roman" w:eastAsia="宋体" w:hAnsi="Times New Roman" w:cs="Times New Roman"/>
+          <w:kern w:val="0"/>
+          <w:sz w:val="24"/>
+        </w:rPr>
+      </w:pPr>
+      <w:r>
+        <w:rPr>
+          <w:rFonts w:ascii="Times New Roman" w:eastAsia="Times New Roman" w:hAnsi="Times New Roman" w:cs="Times New Roman"/>
+          <w:b w:val="0"/>
           <w:kern w:val="0"/>
           <w:sz w:val="24"/>
         </w:rPr>
@@ -8570,7 +8585,8 @@
       <w:proofErr w:type="spellStart"/>
       <w:r>
         <w:rPr>
-          <w:rFonts w:ascii="Times New Roman" w:eastAsia="宋体" w:hAnsi="Times New Roman" w:cs="Times New Roman"/>
+          <w:rFonts w:ascii="Times New Roman" w:eastAsia="Times New Roman" w:hAnsi="Times New Roman" w:cs="Times New Roman"/>
+          <w:b w:val="0"/>
           <w:kern w:val="0"/>
           <w:sz w:val="24"/>
         </w:rPr>
@@ -8579,7 +8595,8 @@
       <w:proofErr w:type="spellEnd"/>
       <w:r>
         <w:rPr>
-          <w:rFonts w:ascii="Times New Roman" w:eastAsia="宋体" w:hAnsi="Times New Roman" w:cs="Times New Roman"/>
+          <w:rFonts w:ascii="Times New Roman" w:eastAsia="Times New Roman" w:hAnsi="Times New Roman" w:cs="Times New Roman"/>
+          <w:b w:val="0"/>
           <w:kern w:val="0"/>
           <w:sz w:val="24"/>
         </w:rPr>
@@ -8590,17 +8607,19 @@
       <w:pPr>
         <w:widowControl/>
         <w:shd w:val="clear" w:color="auto" w:fill="FFFFFF"/>
-        <w:spacing w:before="0" w:beforeAutospacing="1" w:after="0" w:line="240" w:lineRule="auto"/>
-        <w:ind w:left="720" w:hanging="720"/>
-        <w:rPr>
-          <w:rFonts w:ascii="Times New Roman" w:eastAsia="宋体" w:hAnsi="Times New Roman" w:cs="Times New Roman"/>
-          <w:kern w:val="0"/>
-          <w:sz w:val="24"/>
-        </w:rPr>
-      </w:pPr>
-      <w:r>
-        <w:rPr>
-          <w:rFonts w:ascii="Times New Roman" w:eastAsia="宋体" w:hAnsi="Times New Roman" w:cs="Times New Roman"/>
+        <w:spacing w:before="0" w:beforeAutospacing="1" w:after="0" w:line="480" w:lineRule="auto"/>
+        <w:ind w:left="720" w:hanging="720" w:right="0"/>
+        <w:jc w:val="left"/>
+        <w:rPr>
+          <w:rFonts w:ascii="Times New Roman" w:eastAsia="宋体" w:hAnsi="Times New Roman" w:cs="Times New Roman"/>
+          <w:kern w:val="0"/>
+          <w:sz w:val="24"/>
+        </w:rPr>
+      </w:pPr>
+      <w:r>
+        <w:rPr>
+          <w:rFonts w:ascii="Times New Roman" w:eastAsia="Times New Roman" w:hAnsi="Times New Roman" w:cs="Times New Roman"/>
+          <w:b w:val="0"/>
           <w:kern w:val="0"/>
           <w:sz w:val="24"/>
         </w:rPr>
@@ -8611,17 +8630,19 @@
       <w:pPr>
         <w:widowControl/>
         <w:shd w:val="clear" w:color="auto" w:fill="FFFFFF"/>
-        <w:spacing w:before="0" w:beforeAutospacing="1" w:after="0" w:line="240" w:lineRule="auto"/>
-        <w:ind w:left="720" w:hanging="720"/>
-        <w:rPr>
-          <w:rFonts w:ascii="Times New Roman" w:eastAsia="宋体" w:hAnsi="Times New Roman" w:cs="Times New Roman"/>
-          <w:kern w:val="0"/>
-          <w:sz w:val="24"/>
-        </w:rPr>
-      </w:pPr>
-      <w:r>
-        <w:rPr>
-          <w:rFonts w:ascii="Times New Roman" w:eastAsia="宋体" w:hAnsi="Times New Roman" w:cs="Times New Roman"/>
+        <w:spacing w:before="0" w:beforeAutospacing="1" w:after="0" w:line="480" w:lineRule="auto"/>
+        <w:ind w:left="720" w:hanging="720" w:right="0"/>
+        <w:jc w:val="left"/>
+        <w:rPr>
+          <w:rFonts w:ascii="Times New Roman" w:eastAsia="宋体" w:hAnsi="Times New Roman" w:cs="Times New Roman"/>
+          <w:kern w:val="0"/>
+          <w:sz w:val="24"/>
+        </w:rPr>
+      </w:pPr>
+      <w:r>
+        <w:rPr>
+          <w:rFonts w:ascii="Times New Roman" w:eastAsia="Times New Roman" w:hAnsi="Times New Roman" w:cs="Times New Roman"/>
+          <w:b w:val="0"/>
           <w:kern w:val="0"/>
           <w:sz w:val="24"/>
         </w:rPr>
@@ -8632,17 +8653,19 @@
       <w:pPr>
         <w:widowControl/>
         <w:shd w:val="clear" w:color="auto" w:fill="FFFFFF"/>
-        <w:spacing w:before="0" w:beforeAutospacing="1" w:after="0" w:line="240" w:lineRule="auto"/>
-        <w:ind w:left="720" w:hanging="720"/>
-        <w:rPr>
-          <w:rFonts w:ascii="Times New Roman" w:eastAsia="宋体" w:hAnsi="Times New Roman" w:cs="Times New Roman"/>
-          <w:kern w:val="0"/>
-          <w:sz w:val="24"/>
-        </w:rPr>
-      </w:pPr>
-      <w:r>
-        <w:rPr>
-          <w:rFonts w:ascii="Times New Roman" w:eastAsia="宋体" w:hAnsi="Times New Roman" w:cs="Times New Roman"/>
+        <w:spacing w:before="0" w:beforeAutospacing="1" w:after="0" w:line="480" w:lineRule="auto"/>
+        <w:ind w:left="720" w:hanging="720" w:right="0"/>
+        <w:jc w:val="left"/>
+        <w:rPr>
+          <w:rFonts w:ascii="Times New Roman" w:eastAsia="宋体" w:hAnsi="Times New Roman" w:cs="Times New Roman"/>
+          <w:kern w:val="0"/>
+          <w:sz w:val="24"/>
+        </w:rPr>
+      </w:pPr>
+      <w:r>
+        <w:rPr>
+          <w:rFonts w:ascii="Times New Roman" w:eastAsia="Times New Roman" w:hAnsi="Times New Roman" w:cs="Times New Roman"/>
+          <w:b w:val="0"/>
           <w:kern w:val="0"/>
           <w:sz w:val="24"/>
         </w:rPr>
@@ -8651,7 +8674,8 @@
       <w:proofErr w:type="spellStart"/>
       <w:r>
         <w:rPr>
-          <w:rFonts w:ascii="Times New Roman" w:eastAsia="宋体" w:hAnsi="Times New Roman" w:cs="Times New Roman"/>
+          <w:rFonts w:ascii="Times New Roman" w:eastAsia="Times New Roman" w:hAnsi="Times New Roman" w:cs="Times New Roman"/>
+          <w:b w:val="0"/>
           <w:kern w:val="0"/>
           <w:sz w:val="24"/>
         </w:rPr>
@@ -8660,7 +8684,8 @@
       <w:proofErr w:type="spellEnd"/>
       <w:r>
         <w:rPr>
-          <w:rFonts w:ascii="Times New Roman" w:eastAsia="宋体" w:hAnsi="Times New Roman" w:cs="Times New Roman"/>
+          <w:rFonts w:ascii="Times New Roman" w:eastAsia="Times New Roman" w:hAnsi="Times New Roman" w:cs="Times New Roman"/>
+          <w:b w:val="0"/>
           <w:kern w:val="0"/>
           <w:sz w:val="24"/>
         </w:rPr>

</xml_diff>